<commit_message>
ui: clicking a job goes straight to it
inside laplace: a pipeline step now opens that flow in the table, like a flow in
reports already did; the row opens in view, and a filter or search that would hide
it is cleared first.

outside laplace: the source column links to the thing itself where a browser can
open it: the api for http checks, the job page for databricks, the bucket in the
google cloud console for gs:// storage. only http and https become links. sftp,
azure storage and pushed jobs have no such page, so their source is plain text and
no longer underlined as if it were a link.

Co-Authored-By: Claude Opus 5.5 <noreply@anthropic.com>
</commit_message>
<xml_diff>
--- a/docs/reference.docx
+++ b/docs/reference.docx
@@ -1603,7 +1603,21 @@
                 <w:rFonts w:ascii="Times New Roman" w:hAnsi="Times New Roman" w:eastAsia="Batang"/>
                 <w:sz w:val="22"/>
               </w:rPr>
-              <w:t>Shown in the dashboard's source column</w:t>
+              <w:t xml:space="preserve">Shown in the dashboard's source column. HTTP checks, Databricks jobs and </w:t>
+            </w:r>
+            <w:r>
+              <w:rPr>
+                <w:rFonts w:ascii="Consolas" w:hAnsi="Consolas" w:eastAsia="Consolas"/>
+                <w:sz w:val="18"/>
+              </w:rPr>
+              <w:t>gs://</w:t>
+            </w:r>
+            <w:r>
+              <w:rPr>
+                <w:rFonts w:ascii="Times New Roman" w:hAnsi="Times New Roman" w:eastAsia="Batang"/>
+                <w:sz w:val="22"/>
+              </w:rPr>
+              <w:t xml:space="preserve"> storage also link to their page</w:t>
             </w:r>
           </w:p>
         </w:tc>

</xml_diff>